<commit_message>
Align Professional Experience and Leadership with the canonical resume.
</commit_message>
<xml_diff>
--- a/public/resume.docx
+++ b/public/resume.docx
@@ -161,7 +161,7 @@
           <w:b/>
           <w:sz w:val="21"/>
         </w:rPr>
-        <w:t>Independent Contractor — Software Development &amp; Digital Marketing</w:t>
+        <w:t>Marketing Automation, Digital Marketing &amp; Web Development — Independent Contractor</w:t>
       </w:r>
     </w:p>
     <w:p>
@@ -171,10 +171,11 @@
       <w:r>
         <w:rPr>
           <w:rFonts w:ascii="Times New Roman" w:hAnsi="Times New Roman" w:eastAsia="Times New Roman"/>
+          <w:b w:val="0"/>
           <w:i/>
           <w:sz w:val="21"/>
         </w:rPr>
-        <w:t>Self-Employed | Remote / Philippines | 2023 – Present</w:t>
+        <w:t>Self-Employed | Remote, Philippines | 2023 – Present</w:t>
       </w:r>
     </w:p>
     <w:p>
@@ -195,7 +196,7 @@
           <w:rFonts w:ascii="Times New Roman" w:hAnsi="Times New Roman" w:eastAsia="Times New Roman"/>
           <w:sz w:val="21"/>
         </w:rPr>
-        <w:t xml:space="preserve">  Design and deploy custom websites, landing pages, and sales funnels for wellness clients using HTML/CSS/JS, WordPress, Astro.js, and Tailwind CSS, improving lead capture and user experience.</w:t>
+        <w:t xml:space="preserve">  Build responsive websites, landing pages, lead-capture funnels, and conversion pages using HTML, CSS/Tailwind, JavaScript, WordPress, Astro.js, and Systeme.io.</w:t>
       </w:r>
     </w:p>
     <w:p>
@@ -216,7 +217,7 @@
           <w:rFonts w:ascii="Times New Roman" w:hAnsi="Times New Roman" w:eastAsia="Times New Roman"/>
           <w:sz w:val="21"/>
         </w:rPr>
-        <w:t xml:space="preserve">  Plan and optimize Meta advertising campaigns (creative, targeting, budget, reporting) to generate qualified leads for weight loss, diabetes, and neuropathy programs.</w:t>
+        <w:t xml:space="preserve">  Configure CRM forms, lead-management workflows, email/SMS nurture sequences, pipelines, booking paths, and automated follow-up in GoHighLevel and Systeme.io.</w:t>
       </w:r>
     </w:p>
     <w:p>
@@ -237,7 +238,7 @@
           <w:rFonts w:ascii="Times New Roman" w:hAnsi="Times New Roman" w:eastAsia="Times New Roman"/>
           <w:sz w:val="21"/>
         </w:rPr>
-        <w:t xml:space="preserve">  Build and manage full marketing automation in GoHighLevel/Systeme.io including forms, email/SMS sequences, and pipeline tracking to boost conversions and client value.</w:t>
+        <w:t xml:space="preserve">  Create social content, ad creatives, lead magnets, campaign copy, and marketing assets.</w:t>
       </w:r>
     </w:p>
     <w:p>
@@ -258,7 +259,7 @@
           <w:rFonts w:ascii="Times New Roman" w:hAnsi="Times New Roman" w:eastAsia="Times New Roman"/>
           <w:sz w:val="21"/>
         </w:rPr>
-        <w:t xml:space="preserve">  Create lead magnets (e.g. insulin resistance PDFs), testimonial graphics, and before/after visuals; handle SEO, Google reviews, and social content to strengthen client online presence and ROI.</w:t>
+        <w:t xml:space="preserve">  Support Meta advertising, SEO, research, analytics, testing, QA, and deployment troubleshooting.</w:t>
       </w:r>
     </w:p>
     <w:p>
@@ -282,6 +283,7 @@
       <w:r>
         <w:rPr>
           <w:rFonts w:ascii="Times New Roman" w:hAnsi="Times New Roman" w:eastAsia="Times New Roman"/>
+          <w:b w:val="0"/>
           <w:i/>
           <w:sz w:val="21"/>
         </w:rPr>
@@ -306,7 +308,7 @@
           <w:rFonts w:ascii="Times New Roman" w:hAnsi="Times New Roman" w:eastAsia="Times New Roman"/>
           <w:sz w:val="21"/>
         </w:rPr>
-        <w:t xml:space="preserve">  Managed end-to-end digital marketing operations, supporting lead generation, customer acquisition, and business growth.</w:t>
+        <w:t xml:space="preserve">  Supported end-to-end digital marketing operations for lead generation, customer acquisition, and business growth.</w:t>
       </w:r>
     </w:p>
     <w:p>
@@ -327,7 +329,7 @@
           <w:rFonts w:ascii="Times New Roman" w:hAnsi="Times New Roman" w:eastAsia="Times New Roman"/>
           <w:sz w:val="21"/>
         </w:rPr>
-        <w:t xml:space="preserve">  Built and optimized websites, landing pages, and sales funnels using WordPress, GoHighLevel, Systeme.io, and ClickFunnels, including custom HTML, CSS, and JavaScript.</w:t>
+        <w:t xml:space="preserve">  Built and optimized websites, landing pages, and sales funnels using WordPress, GoHighLevel, Systeme.io, ClickFunnels, and custom HTML/CSS/JavaScript.</w:t>
       </w:r>
     </w:p>
     <w:p>
@@ -348,7 +350,35 @@
           <w:rFonts w:ascii="Times New Roman" w:hAnsi="Times New Roman" w:eastAsia="Times New Roman"/>
           <w:sz w:val="21"/>
         </w:rPr>
-        <w:t xml:space="preserve">  Managed Meta (Facebook and Instagram) advertising campaigns, including audience targeting, creative testing, budget management, and performance optimization.</w:t>
+        <w:t xml:space="preserve">  Supported Meta advertising, email marketing, automation workflows, CRM pipelines, SEO research, social content, lead magnets, and performance reporting.</w:t>
+      </w:r>
+    </w:p>
+    <w:p>
+      <w:pPr>
+        <w:keepNext/>
+        <w:spacing w:before="100" w:after="0"/>
+      </w:pPr>
+      <w:r>
+        <w:rPr>
+          <w:rFonts w:ascii="Times New Roman" w:hAnsi="Times New Roman" w:eastAsia="Times New Roman"/>
+          <w:b/>
+          <w:sz w:val="21"/>
+        </w:rPr>
+        <w:t>Full-Time Missionary</w:t>
+      </w:r>
+    </w:p>
+    <w:p>
+      <w:pPr>
+        <w:spacing w:after="30"/>
+      </w:pPr>
+      <w:r>
+        <w:rPr>
+          <w:rFonts w:ascii="Times New Roman" w:hAnsi="Times New Roman" w:eastAsia="Times New Roman"/>
+          <w:b w:val="0"/>
+          <w:i/>
+          <w:sz w:val="21"/>
+        </w:rPr>
+        <w:t>The Church of Jesus Christ of Latter-day Saints | Philippines | August 2021 – August 2023</w:t>
       </w:r>
     </w:p>
     <w:p>
@@ -369,7 +399,7 @@
           <w:rFonts w:ascii="Times New Roman" w:hAnsi="Times New Roman" w:eastAsia="Times New Roman"/>
           <w:sz w:val="21"/>
         </w:rPr>
-        <w:t xml:space="preserve">  Developed email marketing campaigns, automation workflows, CRM pipelines, and lead nurturing systems to improve conversions.</w:t>
+        <w:t xml:space="preserve">  Engaged with 50+ individuals daily through outreach and teaching.</w:t>
       </w:r>
     </w:p>
     <w:p>
@@ -390,7 +420,7 @@
           <w:rFonts w:ascii="Times New Roman" w:hAnsi="Times New Roman" w:eastAsia="Times New Roman"/>
           <w:sz w:val="21"/>
         </w:rPr>
-        <w:t xml:space="preserve">  Created marketing assets including social media content, graphics, ad creatives, lead magnets, and landing page copy.</w:t>
+        <w:t xml:space="preserve">  Trained and mentored new volunteers on communication, documentation, scheduling, and daily operations.</w:t>
       </w:r>
     </w:p>
     <w:p>
@@ -411,162 +441,7 @@
           <w:rFonts w:ascii="Times New Roman" w:hAnsi="Times New Roman" w:eastAsia="Times New Roman"/>
           <w:sz w:val="21"/>
         </w:rPr>
-        <w:t xml:space="preserve">  Conducted SEO research, competitor analysis, market research, and website optimization to improve online visibility.</w:t>
-      </w:r>
-    </w:p>
-    <w:p>
-      <w:pPr>
-        <w:keepLines/>
-        <w:spacing w:after="24"/>
-        <w:ind w:left="317" w:hanging="245"/>
-      </w:pPr>
-      <w:r>
-        <w:rPr>
-          <w:rFonts w:ascii="Times New Roman" w:hAnsi="Times New Roman" w:eastAsia="Times New Roman"/>
-          <w:sz w:val="21"/>
-        </w:rPr>
-        <w:t>•</w:t>
-      </w:r>
-      <w:r>
-        <w:rPr>
-          <w:rFonts w:ascii="Times New Roman" w:hAnsi="Times New Roman" w:eastAsia="Times New Roman"/>
-          <w:sz w:val="21"/>
-        </w:rPr>
-        <w:t xml:space="preserve">  Tracked campaign performance, analyzed marketing data, and prepared reports to support data-driven decision making.</w:t>
-      </w:r>
-    </w:p>
-    <w:p>
-      <w:pPr>
-        <w:tabs>
-          <w:tab w:pos="9432" w:val="right"/>
-        </w:tabs>
-        <w:spacing w:before="100" w:after="0"/>
-      </w:pPr>
-      <w:r>
-        <w:rPr>
-          <w:rFonts w:ascii="Times New Roman" w:hAnsi="Times New Roman" w:eastAsia="Times New Roman"/>
-          <w:b/>
-          <w:sz w:val="21"/>
-        </w:rPr>
-        <w:t>Full-Time Missionary</w:t>
-      </w:r>
-      <w:r>
-        <w:rPr>
-          <w:rFonts w:ascii="Times New Roman" w:hAnsi="Times New Roman" w:eastAsia="Times New Roman"/>
-          <w:b/>
-          <w:sz w:val="21"/>
-        </w:rPr>
-        <w:tab/>
-        <w:t>Philippines</w:t>
-      </w:r>
-    </w:p>
-    <w:p>
-      <w:pPr>
-        <w:tabs>
-          <w:tab w:pos="9432" w:val="right"/>
-        </w:tabs>
-        <w:spacing w:after="30"/>
-      </w:pPr>
-      <w:r>
-        <w:rPr>
-          <w:rFonts w:ascii="Times New Roman" w:hAnsi="Times New Roman" w:eastAsia="Times New Roman"/>
-          <w:i/>
-          <w:sz w:val="21"/>
-        </w:rPr>
-        <w:t>The Church of Jesus Christ of Latter-day Saints</w:t>
-      </w:r>
-      <w:r>
-        <w:rPr>
-          <w:rFonts w:ascii="Times New Roman" w:hAnsi="Times New Roman" w:eastAsia="Times New Roman"/>
-          <w:i/>
-          <w:sz w:val="21"/>
-        </w:rPr>
-        <w:tab/>
-        <w:t>August 2021 – August 2023</w:t>
-      </w:r>
-    </w:p>
-    <w:p>
-      <w:pPr>
-        <w:keepLines/>
-        <w:spacing w:after="24"/>
-        <w:ind w:left="317" w:hanging="245"/>
-      </w:pPr>
-      <w:r>
-        <w:rPr>
-          <w:rFonts w:ascii="Times New Roman" w:hAnsi="Times New Roman" w:eastAsia="Times New Roman"/>
-          <w:sz w:val="21"/>
-        </w:rPr>
-        <w:t>•</w:t>
-      </w:r>
-      <w:r>
-        <w:rPr>
-          <w:rFonts w:ascii="Times New Roman" w:hAnsi="Times New Roman" w:eastAsia="Times New Roman"/>
-          <w:sz w:val="21"/>
-        </w:rPr>
-        <w:t xml:space="preserve">  Engaged 50+ individuals daily through outreach and teaching, developing strong interpersonal, customer service, and cross-cultural communication skills.</w:t>
-      </w:r>
-    </w:p>
-    <w:p>
-      <w:pPr>
-        <w:keepLines/>
-        <w:spacing w:after="24"/>
-        <w:ind w:left="317" w:hanging="245"/>
-      </w:pPr>
-      <w:r>
-        <w:rPr>
-          <w:rFonts w:ascii="Times New Roman" w:hAnsi="Times New Roman" w:eastAsia="Times New Roman"/>
-          <w:sz w:val="21"/>
-        </w:rPr>
-        <w:t>•</w:t>
-      </w:r>
-      <w:r>
-        <w:rPr>
-          <w:rFonts w:ascii="Times New Roman" w:hAnsi="Times New Roman" w:eastAsia="Times New Roman"/>
-          <w:sz w:val="21"/>
-        </w:rPr>
-        <w:t xml:space="preserve">  Trained and mentored 3 new volunteers on techniques and documentation, accelerating team contribution and performance.</w:t>
-      </w:r>
-    </w:p>
-    <w:p>
-      <w:pPr>
-        <w:keepLines/>
-        <w:spacing w:after="24"/>
-        <w:ind w:left="317" w:hanging="245"/>
-      </w:pPr>
-      <w:r>
-        <w:rPr>
-          <w:rFonts w:ascii="Times New Roman" w:hAnsi="Times New Roman" w:eastAsia="Times New Roman"/>
-          <w:sz w:val="21"/>
-        </w:rPr>
-        <w:t>•</w:t>
-      </w:r>
-      <w:r>
-        <w:rPr>
-          <w:rFonts w:ascii="Times New Roman" w:hAnsi="Times New Roman" w:eastAsia="Times New Roman"/>
-          <w:sz w:val="21"/>
-        </w:rPr>
-        <w:t xml:space="preserve">  Maintained precise daily reports, contact records, and progress metrics for accountability and data-driven decisions.</w:t>
-      </w:r>
-    </w:p>
-    <w:p>
-      <w:pPr>
-        <w:keepLines/>
-        <w:spacing w:after="24"/>
-        <w:ind w:left="317" w:hanging="245"/>
-      </w:pPr>
-      <w:r>
-        <w:rPr>
-          <w:rFonts w:ascii="Times New Roman" w:hAnsi="Times New Roman" w:eastAsia="Times New Roman"/>
-          <w:sz w:val="21"/>
-        </w:rPr>
-        <w:t>•</w:t>
-      </w:r>
-      <w:r>
-        <w:rPr>
-          <w:rFonts w:ascii="Times New Roman" w:hAnsi="Times New Roman" w:eastAsia="Times New Roman"/>
-          <w:sz w:val="21"/>
-        </w:rPr>
-        <w:t xml:space="preserve">  Collaborated with 20+ person teams on scheduling and goal achievement in fast-paced environments; incorporated leader feedback to improve methods continuously.</w:t>
+        <w:t xml:space="preserve">  Maintained contact records, schedules, goals, and progress reports while working in large teams.</w:t>
       </w:r>
     </w:p>
     <w:p>
@@ -585,12 +460,12 @@
     </w:p>
     <w:p>
       <w:pPr>
-        <w:keepNext/>
         <w:spacing w:after="30"/>
       </w:pPr>
       <w:r>
         <w:rPr>
           <w:rFonts w:ascii="Times New Roman" w:hAnsi="Times New Roman" w:eastAsia="Times New Roman"/>
+          <w:b w:val="0"/>
           <w:i/>
           <w:sz w:val="21"/>
         </w:rPr>
@@ -615,7 +490,7 @@
           <w:rFonts w:ascii="Times New Roman" w:hAnsi="Times New Roman" w:eastAsia="Times New Roman"/>
           <w:sz w:val="21"/>
         </w:rPr>
-        <w:t xml:space="preserve">  Prepared and reviewed budget reports and financial documents for municipal departments, supporting accurate fiscal planning and transparency.</w:t>
+        <w:t xml:space="preserve">  Prepared budget reports, financial documents, and official correspondence.</w:t>
       </w:r>
     </w:p>
     <w:p>
@@ -636,28 +511,7 @@
           <w:rFonts w:ascii="Times New Roman" w:hAnsi="Times New Roman" w:eastAsia="Times New Roman"/>
           <w:sz w:val="21"/>
         </w:rPr>
-        <w:t xml:space="preserve">  Drafted official correspondence and managed inter-office updates on budget allocations and procedures.</w:t>
-      </w:r>
-    </w:p>
-    <w:p>
-      <w:pPr>
-        <w:keepLines/>
-        <w:spacing w:after="24"/>
-        <w:ind w:left="317" w:hanging="245"/>
-      </w:pPr>
-      <w:r>
-        <w:rPr>
-          <w:rFonts w:ascii="Times New Roman" w:hAnsi="Times New Roman" w:eastAsia="Times New Roman"/>
-          <w:sz w:val="21"/>
-        </w:rPr>
-        <w:t>•</w:t>
-      </w:r>
-      <w:r>
-        <w:rPr>
-          <w:rFonts w:ascii="Times New Roman" w:hAnsi="Times New Roman" w:eastAsia="Times New Roman"/>
-          <w:sz w:val="21"/>
-        </w:rPr>
-        <w:t xml:space="preserve">  Reorganized filing systems (physical/digital) to improve document retrieval speed and office efficiency; provided broad administrative support demonstrating reliability and multitasking.</w:t>
+        <w:t xml:space="preserve">  Reorganized physical and digital filing systems and provided administrative support.</w:t>
       </w:r>
     </w:p>
     <w:p>
@@ -697,10 +551,25 @@
       <w:r>
         <w:rPr>
           <w:rFonts w:ascii="Times New Roman" w:hAnsi="Times New Roman" w:eastAsia="Times New Roman"/>
+          <w:b w:val="0"/>
           <w:i/>
           <w:sz w:val="21"/>
         </w:rPr>
         <w:t>The Church of Jesus Christ of Latter-day Saints | Philippines | 2021 – 2023</w:t>
+      </w:r>
+    </w:p>
+    <w:p>
+      <w:pPr>
+        <w:spacing w:after="30"/>
+      </w:pPr>
+      <w:r>
+        <w:rPr>
+          <w:rFonts w:ascii="Times New Roman" w:hAnsi="Times New Roman" w:eastAsia="Times New Roman"/>
+          <w:b w:val="0"/>
+          <w:i/>
+          <w:sz w:val="21"/>
+        </w:rPr>
+        <w:t>Junior Companion → District Leader Trainer → Senior Companion → District Leader → Zone Leader → Zone Leader Lead</w:t>
       </w:r>
     </w:p>
     <w:p>
@@ -721,7 +590,7 @@
           <w:rFonts w:ascii="Times New Roman" w:hAnsi="Times New Roman" w:eastAsia="Times New Roman"/>
           <w:sz w:val="21"/>
         </w:rPr>
-        <w:t xml:space="preserve">  Progressed through leadership track: Junior Companion → District Leader Trainer → Senior Companion → District Leader → Zone Leader → Zone Leader Lead (2021–2023).</w:t>
+        <w:t xml:space="preserve">  Progressed through increasing leadership responsibilities across district and zone assignments.</w:t>
       </w:r>
     </w:p>
     <w:p>
@@ -742,7 +611,7 @@
           <w:rFonts w:ascii="Times New Roman" w:hAnsi="Times New Roman" w:eastAsia="Times New Roman"/>
           <w:sz w:val="21"/>
         </w:rPr>
-        <w:t xml:space="preserve">  Led and trained 10–30+ missionaries across districts/zones on teaching effectiveness, time management, and operations; delivered training, coaching, and evaluations to build team performance.</w:t>
+        <w:t xml:space="preserve">  Led and trained teams of 10–30+ missionaries on communication, teaching effectiveness, time management, scheduling, reporting, coaching, and performance improvement.</w:t>
       </w:r>
     </w:p>
     <w:p>
@@ -763,7 +632,7 @@
           <w:rFonts w:ascii="Times New Roman" w:hAnsi="Times New Roman" w:eastAsia="Times New Roman"/>
           <w:sz w:val="21"/>
         </w:rPr>
-        <w:t xml:space="preserve">  Established goal-setting, scheduling, and reporting systems that improved accountability, transparency, and results in assigned areas</w:t>
+        <w:t xml:space="preserve">  Supported goal-setting, accountability, and operational coordination across assigned teams.</w:t>
       </w:r>
     </w:p>
     <w:p>

</xml_diff>

<commit_message>
Show BYU–Idaho only as completed education, not a current student role.
</commit_message>
<xml_diff>
--- a/public/resume.docx
+++ b/public/resume.docx
@@ -662,7 +662,7 @@
           <w:b/>
           <w:sz w:val="21"/>
         </w:rPr>
-        <w:t>Brigham Young University, Idaho</w:t>
+        <w:t>Brigham Young University–Idaho</w:t>
       </w:r>
     </w:p>
     <w:p>
@@ -687,7 +687,7 @@
           <w:sz w:val="21"/>
         </w:rPr>
         <w:tab/>
-        <w:t>Graduated</w:t>
+        <w:t>Graduated: February 21, 2026</w:t>
       </w:r>
     </w:p>
     <w:p>
@@ -701,7 +701,7 @@
           <w:b/>
           <w:sz w:val="21"/>
         </w:rPr>
-        <w:t>Brigham Young University, Idaho</w:t>
+        <w:t>Brigham Young University–Idaho</w:t>
       </w:r>
     </w:p>
     <w:p>
@@ -726,7 +726,7 @@
           <w:sz w:val="21"/>
         </w:rPr>
         <w:tab/>
-        <w:t>Graduated</w:t>
+        <w:t>Graduated: December 13, 2025</w:t>
       </w:r>
     </w:p>
     <w:p>

</xml_diff>